<commit_message>
fix: audit remediation — all 8 findings resolved (H1, H2, M1–M3, L1–L3)
H1: database_summary.md — DB size ~100→~195 MB; script v1→v2 (×2 refs); regen .docx
H2: requirements.txt — add python-docx>=1.1.0; update statsmodels comment
M1: debugging.md Script Version History — v1 marked Retired; v2 added as Current
M2: calculate_isuimpact_v2.py — replace hardcoded abs path with Path(__file__).parent
M3: create CLAUDE.md — project conventions, key numbers, pre-submission check
L1: move 8 archive-candidate fix_*.py scripts to archive/fix_scripts/
L2: significance_draft_v1, project_documentation → outdated in file_inventory
L3: .gitignore — remove stale literal sqlite.bak_v2 entry (covered by wildcard)

Co-Authored-By: Claude Sonnet 4.6 <noreply@anthropic.com>
</commit_message>
<xml_diff>
--- a/database_summary.docx
+++ b/database_summary.docx
@@ -45,7 +45,7 @@
         <w:t>figure_skating_ijs_v4.sqlite</w:t>
       </w:r>
       <w:r>
-        <w:t xml:space="preserve"> (~100 MB) — single canonical database</w:t>
+        <w:t xml:space="preserve"> (~195 MB) — single canonical database</w:t>
       </w:r>
     </w:p>
     <w:p>
@@ -1197,10 +1197,20 @@
           <w:rFonts w:ascii="Courier New" w:hAnsi="Courier New"/>
           <w:sz w:val="20"/>
         </w:rPr>
-        <w:t>calculate_isuimpact_v1.py</w:t>
+        <w:t>calculate_isuimpact_v2.py</w:t>
       </w:r>
       <w:r>
-        <w:t xml:space="preserve"> with M = 10,000 permutations, seed = 20260223, global CDF. 271,728 rows across 142 events.</w:t>
+        <w:t xml:space="preserve"> (method: </w:t>
+      </w:r>
+      <w:r>
+        <w:rPr>
+          <w:rFonts w:ascii="Courier New" w:hAnsi="Courier New"/>
+          <w:sz w:val="20"/>
+        </w:rPr>
+        <w:t>isuimpact_residual_v1</w:t>
+      </w:r>
+      <w:r>
+        <w:t>) with M = 10,000 permutations, seed = 20260223. 271,728 rows across 142 events.</w:t>
       </w:r>
     </w:p>
     <w:p>
@@ -1328,7 +1338,7 @@
           <w:rFonts w:ascii="Courier New" w:hAnsi="Courier New"/>
           <w:sz w:val="20"/>
         </w:rPr>
-        <w:t>calculate_isuimpact_v1.py</w:t>
+        <w:t>calculate_isuimpact_v2.py</w:t>
       </w:r>
       <w:r>
         <w:t xml:space="preserve">, </w:t>

</xml_diff>